<commit_message>
Letterhead: tighten header and footer for more writing room
Name and credentials on one line, less space under the header rule,
smaller bottom margin. Writing area grows from about 7.9 in to 8.5 in.

Co-Authored-By: Claude Opus 5.5 <noreply@anthropic.com>
Claude-Session: https://claude.ai/code/session_012i8wR9qeLtNBrvBzFpQnCL
</commit_message>
<xml_diff>
--- a/print/letterhead/thomack-letterhead.docx
+++ b/print/letterhead/thomack-letterhead.docx
@@ -192,7 +192,7 @@
       <w:footerReference w:type="default" r:id="rId9"/>
       <w:footerReference w:type="first" r:id="rId10"/>
       <w:pgSz w:w="12240" w:h="15840" w:orient="portrait"/>
-      <w:pgMar w:top="1655" w:right="1440" w:bottom="1584" w:left="1440" w:header="792" w:footer="720" w:gutter="0"/>
+      <w:pgMar w:top="1655" w:right="1440" w:bottom="1224" w:left="1440" w:header="720" w:footer="648" w:gutter="0"/>
       <w:pgNumType/>
       <w:titlePg/>
       <w:docGrid w:linePitch="360"/>
@@ -370,13 +370,13 @@
       </w:tblBorders>
     </w:tblPr>
     <w:tblGrid>
-      <w:gridCol w:w="6263"/>
-      <w:gridCol w:w="3096"/>
+      <w:gridCol w:w="5832"/>
+      <w:gridCol w:w="3528"/>
     </w:tblGrid>
     <w:tr>
       <w:tc>
         <w:tcPr>
-          <w:tcW w:type="dxa" w:w="6263"/>
+          <w:tcW w:type="dxa" w:w="5832"/>
           <w:tcBorders>
             <w:top w:val="none" w:color="FFFFFF" w:sz="0"/>
             <w:left w:val="none" w:color="FFFFFF" w:sz="0"/>
@@ -437,7 +437,7 @@
       </w:tc>
       <w:tc>
         <w:tcPr>
-          <w:tcW w:type="dxa" w:w="3096"/>
+          <w:tcW w:type="dxa" w:w="3528"/>
           <w:tcBorders>
             <w:top w:val="none" w:color="FFFFFF" w:sz="0"/>
             <w:left w:val="none" w:color="FFFFFF" w:sz="0"/>
@@ -460,24 +460,10 @@
               <w:b/>
               <w:bCs/>
               <w:color w:val="163A47"/>
-              <w:sz w:val="19"/>
-              <w:szCs w:val="19"/>
-            </w:rPr>
-            <w:t xml:space="preserve">Katy Thomack</w:t>
-          </w:r>
-        </w:p>
-        <w:p>
-          <w:pPr>
-            <w:spacing w:after="0" w:line="264" w:lineRule="auto"/>
-          </w:pPr>
-          <w:r>
-            <w:rPr>
-              <w:rFonts w:ascii="Georgia" w:cs="Georgia" w:eastAsia="Georgia" w:hAnsi="Georgia"/>
-              <w:color w:val="163A47"/>
               <w:sz w:val="17"/>
               <w:szCs w:val="17"/>
             </w:rPr>
-            <w:t xml:space="preserve">RN, MSN, CLNC</w:t>
+            <w:t xml:space="preserve">Katy Thomack, RN, MSN, CLNC</w:t>
           </w:r>
         </w:p>
         <w:p>
@@ -530,7 +516,7 @@
       <w:pBdr>
         <w:bottom w:val="single" w:color="B08D57" w:sz="6" w:space="6"/>
       </w:pBdr>
-      <w:spacing w:after="480" w:before="60"/>
+      <w:spacing w:after="240" w:before="60"/>
     </w:pPr>
   </w:p>
 </w:hdr>

</xml_diff>

<commit_message>
Letterhead: add .dotx template; placeholders in normal text color
Co-Authored-By: Claude Opus 5.5 <noreply@anthropic.com>
Claude-Session: https://claude.ai/code/session_012i8wR9qeLtNBrvBzFpQnCL
</commit_message>
<xml_diff>
--- a/print/letterhead/thomack-letterhead.docx
+++ b/print/letterhead/thomack-letterhead.docx
@@ -9,7 +9,7 @@
       <w:r>
         <w:rPr>
           <w:rFonts w:ascii="Georgia" w:cs="Georgia" w:eastAsia="Georgia" w:hAnsi="Georgia"/>
-          <w:color w:val="55666E"/>
+          <w:color w:val="1D2A30"/>
         </w:rPr>
         <w:t xml:space="preserve">[Date]</w:t>
       </w:r>
@@ -26,7 +26,7 @@
       <w:r>
         <w:rPr>
           <w:rFonts w:ascii="Georgia" w:cs="Georgia" w:eastAsia="Georgia" w:hAnsi="Georgia"/>
-          <w:color w:val="55666E"/>
+          <w:color w:val="1D2A30"/>
         </w:rPr>
         <w:t xml:space="preserve">[Attorney Name], Esq.</w:t>
       </w:r>
@@ -38,7 +38,7 @@
       <w:r>
         <w:rPr>
           <w:rFonts w:ascii="Georgia" w:cs="Georgia" w:eastAsia="Georgia" w:hAnsi="Georgia"/>
-          <w:color w:val="55666E"/>
+          <w:color w:val="1D2A30"/>
         </w:rPr>
         <w:t xml:space="preserve">[Law Firm]</w:t>
       </w:r>
@@ -50,7 +50,7 @@
       <w:r>
         <w:rPr>
           <w:rFonts w:ascii="Georgia" w:cs="Georgia" w:eastAsia="Georgia" w:hAnsi="Georgia"/>
-          <w:color w:val="55666E"/>
+          <w:color w:val="1D2A30"/>
         </w:rPr>
         <w:t xml:space="preserve">[Street Address]</w:t>
       </w:r>
@@ -62,7 +62,7 @@
       <w:r>
         <w:rPr>
           <w:rFonts w:ascii="Georgia" w:cs="Georgia" w:eastAsia="Georgia" w:hAnsi="Georgia"/>
-          <w:color w:val="55666E"/>
+          <w:color w:val="1D2A30"/>
         </w:rPr>
         <w:t xml:space="preserve">[City, State ZIP]</w:t>
       </w:r>
@@ -91,7 +91,7 @@
       <w:r>
         <w:rPr>
           <w:rFonts w:ascii="Georgia" w:cs="Georgia" w:eastAsia="Georgia" w:hAnsi="Georgia"/>
-          <w:color w:val="55666E"/>
+          <w:color w:val="1D2A30"/>
         </w:rPr>
         <w:t xml:space="preserve">[Case name / matter]</w:t>
       </w:r>
@@ -108,7 +108,7 @@
       <w:r>
         <w:rPr>
           <w:rFonts w:ascii="Georgia" w:cs="Georgia" w:eastAsia="Georgia" w:hAnsi="Georgia"/>
-          <w:color w:val="55666E"/>
+          <w:color w:val="1D2A30"/>
         </w:rPr>
         <w:t xml:space="preserve">Dear [Attorney Name]:</w:t>
       </w:r>
@@ -125,7 +125,7 @@
       <w:r>
         <w:rPr>
           <w:rFonts w:ascii="Georgia" w:cs="Georgia" w:eastAsia="Georgia" w:hAnsi="Georgia"/>
-          <w:color w:val="55666E"/>
+          <w:color w:val="1D2A30"/>
         </w:rPr>
         <w:t xml:space="preserve">[Begin typing your letter here.]</w:t>
       </w:r>

</xml_diff>